<commit_message>
Regenerate discussion files with project URL, DOI and version
Output of `uv run python -m src.export_discussions` at version
2026.10.13: all 6,708 per-discussion files and discussions.jsonl.gz now
carry the repository link, the Zenodo DOI and the version.

Co-Authored-By: Claude Fable 5.1 <noreply@anthropic.com>
</commit_message>
<xml_diff>
--- a/discussions/1900/1900-02-10_ak_d0878.docx
+++ b/discussions/1900/1900-02-10_ak_d0878.docx
@@ -51,7 +51,50 @@
         <w:t xml:space="preserve">Källa: </w:t>
       </w:r>
       <w:r>
-        <w:t>Tal om Kvinnor: Annotated Corpus (doi:10.5281/zenodo.18211787), byggd på The Swedish Parliament Corpus (Yrjänäinen m.fl. 2024).</w:t>
+        <w:t>Tal om Kvinnor: Annotated Corpus, byggd på The Swedish Parliament Corpus (Yrjänäinen m.fl. 2024).</w:t>
+      </w:r>
+    </w:p>
+    <w:p>
+      <w:r>
+        <w:rPr>
+          <w:b/>
+        </w:rPr>
+        <w:t xml:space="preserve">Projekt: </w:t>
+      </w:r>
+      <w:hyperlink r:id="rId9">
+        <w:r>
+          <w:rPr>
+            <w:rStyle w:val="Hyperlink"/>
+          </w:rPr>
+          <w:t xml:space="preserve">https://github.com/DigitalHistory-Lund/ToK-Preparer</w:t>
+        </w:r>
+      </w:hyperlink>
+    </w:p>
+    <w:p>
+      <w:r>
+        <w:rPr>
+          <w:b/>
+        </w:rPr>
+        <w:t xml:space="preserve">DOI: </w:t>
+      </w:r>
+      <w:hyperlink r:id="rId10">
+        <w:r>
+          <w:rPr>
+            <w:rStyle w:val="Hyperlink"/>
+          </w:rPr>
+          <w:t xml:space="preserve">https://doi.org/10.5281/zenodo.18211787</w:t>
+        </w:r>
+      </w:hyperlink>
+    </w:p>
+    <w:p>
+      <w:r>
+        <w:rPr>
+          <w:b/>
+        </w:rPr>
+        <w:t xml:space="preserve">Version: </w:t>
+      </w:r>
+      <w:r>
+        <w:t>2026.10.13</w:t>
       </w:r>
     </w:p>
     <w:p>

</xml_diff>